<commit_message>
courseware v2.5: Big Five always-on agents with per-agent features
- Manus Cue joins Claude Duet, Meta Muse, Grok Bot and OpenAI Dots (Big Five
  overview and comparison).
- A "What It Can Do" features slide for each agent from official vendor
  sources, plus Manus general-agent capabilities with example prompts and the
  Manus 2.0 additions.
- "How to Set Up Manus Cue" added as a reference route; assessed Activity 1
  routes unchanged.
- Practice Exam slide (exams.tertiaryinfotech.com) restored before the final
  assessment.
- QA fixes: sourced access wording, learner-facing kickers and subtitles,
  Duet/Cue setup wording, Thank You layout, LG step numbering per route.
- LP, LG and README aligned to v2.5.

Co-Authored-By: Claude Opus 5.5 <noreply@anthropic.com>
</commit_message>
<xml_diff>
--- a/courseware/LG-Human-AI Workforce with Autonomous AI Agents.docx
+++ b/courseware/LG-Human-AI Workforce with Autonomous AI Agents.docx
@@ -179,7 +179,7 @@
           <w:color w:val="1F6FEB"/>
           <w:sz w:val="24"/>
         </w:rPr>
-        <w:t>Version 2.4</w:t>
+        <w:t>Version 2.5</w:t>
       </w:r>
     </w:p>
     <w:p>
@@ -1270,6 +1270,64 @@
           </w:p>
         </w:tc>
       </w:tr>
+      <w:tr>
+        <w:tc>
+          <w:tcPr>
+            <w:tcW w:type="dxa" w:w="1152"/>
+          </w:tcPr>
+          <w:p>
+            <w:r/>
+            <w:r>
+              <w:rPr>
+                <w:sz w:val="19"/>
+              </w:rPr>
+              <w:t>2.5</w:t>
+            </w:r>
+          </w:p>
+        </w:tc>
+        <w:tc>
+          <w:tcPr>
+            <w:tcW w:type="dxa" w:w="1656"/>
+          </w:tcPr>
+          <w:p>
+            <w:r/>
+            <w:r>
+              <w:rPr>
+                <w:sz w:val="19"/>
+              </w:rPr>
+              <w:t>29 October 2026</w:t>
+            </w:r>
+          </w:p>
+        </w:tc>
+        <w:tc>
+          <w:tcPr>
+            <w:tcW w:type="dxa" w:w="5544"/>
+          </w:tcPr>
+          <w:p>
+            <w:r/>
+            <w:r>
+              <w:rPr>
+                <w:sz w:val="19"/>
+              </w:rPr>
+              <w:t>Always-on comparison extended to the Big Five with Manus Cue (official Manus sources). A features slide for each agent (Claude Duet, Meta Muse, Grok Bot, OpenAI Dots, Manus Cue), plus Manus general-agent capabilities with worked examples and the Manus 2.0 additions; Big Five comparison follows the features. 'How to Set Up Manus Cue' added as a reference route (assessed routes unchanged). Practice Exam slide (exams.tertiaryinfotech.com) restored before the final assessment. LG Topic 1 and LP aligned.</w:t>
+            </w:r>
+          </w:p>
+        </w:tc>
+        <w:tc>
+          <w:tcPr>
+            <w:tcW w:type="dxa" w:w="1440"/>
+          </w:tcPr>
+          <w:p>
+            <w:r/>
+            <w:r>
+              <w:rPr>
+                <w:sz w:val="19"/>
+              </w:rPr>
+              <w:t>Dr. Alfred Ang</w:t>
+            </w:r>
+          </w:p>
+        </w:tc>
+      </w:tr>
     </w:tbl>
     <w:p>
       <w:r>
@@ -1510,7 +1568,7 @@
           <w:color w:val="333333"/>
           <w:sz w:val="21"/>
         </w:rPr>
-        <w:t>1.5 Always-on deployment and the Big Four</w:t>
+        <w:t>1.5 Always-on deployment and the Big Five</w:t>
         <w:tab/>
         <w:t>10</w:t>
       </w:r>
@@ -1532,7 +1590,7 @@
         </w:rPr>
         <w:t>1.6 How to set up an always-on assistant</w:t>
         <w:tab/>
-        <w:t>11</w:t>
+        <w:t>12</w:t>
       </w:r>
     </w:p>
     <w:p>
@@ -1552,7 +1610,7 @@
         </w:rPr>
         <w:t>1.7 Evidence, ongoing work and human control</w:t>
         <w:tab/>
-        <w:t>12</w:t>
+        <w:t>13</w:t>
       </w:r>
     </w:p>
     <w:p>
@@ -1572,7 +1630,7 @@
         </w:rPr>
         <w:t>Lab 1 — Activity 1 — Set Up an Always-On Personal Assistant</w:t>
         <w:tab/>
-        <w:t>12</w:t>
+        <w:t>13</w:t>
       </w:r>
     </w:p>
     <w:p>
@@ -1592,7 +1650,7 @@
         </w:rPr>
         <w:t>1.8 Under the hood: how agents work</w:t>
         <w:tab/>
-        <w:t>16</w:t>
+        <w:t>17</w:t>
       </w:r>
     </w:p>
     <w:p>
@@ -1612,7 +1670,7 @@
         </w:rPr>
         <w:t>1.9 Sources and further reading</w:t>
         <w:tab/>
-        <w:t>18</w:t>
+        <w:t>19</w:t>
       </w:r>
     </w:p>
     <w:p>
@@ -1631,7 +1689,7 @@
         </w:rPr>
         <w:t>Topic 2 — Hermes Agent — Single-Agent Office Automation, Tools &amp; Skills</w:t>
         <w:tab/>
-        <w:t>19</w:t>
+        <w:t>20</w:t>
       </w:r>
     </w:p>
     <w:p>
@@ -1651,7 +1709,7 @@
         </w:rPr>
         <w:t>Introducing the company scenario — at the start of the Hermes labs</w:t>
         <w:tab/>
-        <w:t>19</w:t>
+        <w:t>20</w:t>
       </w:r>
     </w:p>
     <w:p>
@@ -1671,7 +1729,7 @@
         </w:rPr>
         <w:t>Lab 2 — Activity 2 — Hermes Desktop, Tools, Skills &amp; the Company Brief</w:t>
         <w:tab/>
-        <w:t>20</w:t>
+        <w:t>21</w:t>
       </w:r>
     </w:p>
     <w:p>
@@ -1691,7 +1749,7 @@
         </w:rPr>
         <w:t>Lab 3 — Activity 3 — Hermes Gmail, Calendar, Drive &amp; Excel</w:t>
         <w:tab/>
-        <w:t>24</w:t>
+        <w:t>25</w:t>
       </w:r>
     </w:p>
     <w:p>
@@ -1711,7 +1769,7 @@
         </w:rPr>
         <w:t>Lab 4 — Activity 4 — Hermes Dashboard, Professional PPT &amp; Single-Agent Video</w:t>
         <w:tab/>
-        <w:t>28</w:t>
+        <w:t>30</w:t>
       </w:r>
     </w:p>
     <w:p>
@@ -1730,7 +1788,7 @@
         </w:rPr>
         <w:t>Topic 3 — Hermes Teams &amp; OpenAI Dots — Kanban, Video &amp; Human Oversight</w:t>
         <w:tab/>
-        <w:t>33</w:t>
+        <w:t>34</w:t>
       </w:r>
     </w:p>
     <w:p>
@@ -1750,7 +1808,7 @@
         </w:rPr>
         <w:t>Lab 5 — Activity 5 — Hermes Bots &amp; Kanban Video Studio</w:t>
         <w:tab/>
-        <w:t>33</w:t>
+        <w:t>35</w:t>
       </w:r>
     </w:p>
     <w:p>
@@ -1770,7 +1828,7 @@
         </w:rPr>
         <w:t>Lab 6 — Activity 6 — Source Assurance, RAG Comparison &amp; Maintenance</w:t>
         <w:tab/>
-        <w:t>38</w:t>
+        <w:t>39</w:t>
       </w:r>
     </w:p>
     <w:p>
@@ -1790,7 +1848,7 @@
         </w:rPr>
         <w:t>Lab 7 — Activity 7 — OpenAI Dots: Supervised Launch Review</w:t>
         <w:tab/>
-        <w:t>40</w:t>
+        <w:t>42</w:t>
       </w:r>
     </w:p>
     <w:p>
@@ -1810,7 +1868,7 @@
         </w:rPr>
         <w:t>Lab 8 — Activity 8 — Revise, Verify &amp; Release the Team Video Locally</w:t>
         <w:tab/>
-        <w:t>43</w:t>
+        <w:t>45</w:t>
       </w:r>
     </w:p>
     <w:p>
@@ -1829,7 +1887,7 @@
         </w:rPr>
         <w:t>Assessment Preparation</w:t>
         <w:tab/>
-        <w:t>47</w:t>
+        <w:t>49</w:t>
       </w:r>
     </w:p>
     <w:p>
@@ -1848,7 +1906,7 @@
         </w:rPr>
         <w:t>Glossary</w:t>
         <w:tab/>
-        <w:t>47</w:t>
+        <w:t>49</w:t>
       </w:r>
       <w:r>
         <w:fldChar w:fldCharType="end"/>
@@ -2256,7 +2314,7 @@
               <w:rPr>
                 <w:sz w:val="19"/>
               </w:rPr>
-              <w:t>Brief AI history and two human–AI work modes; Big Four: Duet, Muse, Grok Bot and Dots; Activity 1 · Set up an always-on assistant; Under the hood: harness, loop, context and human decisions; Activity 1: set up an always-on assistant</w:t>
+              <w:t>Brief AI history and two human–AI work modes; Big Five: Duet, Muse, Grok Bot, Dots and Manus Cue; Activity 1 · Set up an always-on assistant; Under the hood: harness, loop, context and human decisions; Activity 1: set up an always-on assistant</w:t>
             </w:r>
           </w:p>
         </w:tc>
@@ -3785,17 +3843,17 @@
         <w:pStyle w:val="Heading2"/>
       </w:pPr>
       <w:r>
-        <w:t>1.5 Always-on deployment and the Big Four</w:t>
-      </w:r>
-    </w:p>
-    <w:p>
-      <w:r>
-        <w:t>OpenClaw → Hermes → hosted agents such as Dots, Muse, Duet and Grok Bot is a teaching progression through deployment/work choices, not corporate lineage. Local agents stop when their runtime stops; a managed cloud agent can keep working while your device is off, within its current limits. A list of avatars is not proof of multi-agent execution; verify actual worker runs, owned outputs and hand-offs.</w:t>
-      </w:r>
-    </w:p>
-    <w:p>
-      <w:r>
-        <w:t>Use the requested BULDRR article's job-fit, control, access and limits framework. It was updated on 22 October 2026; newer official vendor information takes precedence. This is a task-selection framework, not an independent performance benchmark or a universal ranking.</w:t>
+        <w:t>1.5 Always-on deployment and the Big Five</w:t>
+      </w:r>
+    </w:p>
+    <w:p>
+      <w:r>
+        <w:t>OpenClaw → Hermes → hosted agents such as Dots, Muse, Duet, Grok Bot and Cue is a teaching progression through deployment/work choices, not corporate lineage. Local agents stop when their runtime stops; a managed cloud agent can keep working while your device is off, within its current limits. A list of avatars is not proof of multi-agent execution; verify actual worker runs, owned outputs and hand-offs.</w:t>
+      </w:r>
+    </w:p>
+    <w:p>
+      <w:r>
+        <w:t>Compare the agents with a job-fit, control, access and limits framework (BULDRR). It was updated on 22 October 2026; newer official vendor information takes precedence. This is a task-selection framework, not an independent performance benchmark or a universal ranking.</w:t>
       </w:r>
     </w:p>
     <w:tbl>
@@ -4045,6 +4103,331 @@
       </w:pPr>
     </w:p>
     <w:p>
+      <w:pPr>
+        <w:pStyle w:val="Heading3"/>
+      </w:pPr>
+      <w:r>
+        <w:t>What each always-on agent can do</w:t>
+      </w:r>
+    </w:p>
+    <w:p>
+      <w:r>
+        <w:t>Features below are from each vendor's official pages, checked 29 October 2026.</w:t>
+      </w:r>
+    </w:p>
+    <w:tbl>
+      <w:tblPr>
+        <w:tblStyle w:val="TableGrid"/>
+        <w:tblW w:type="auto" w:w="0"/>
+        <w:tblLook w:firstColumn="1" w:firstRow="1" w:lastColumn="0" w:lastRow="0" w:noHBand="0" w:noVBand="1" w:val="04A0"/>
+      </w:tblPr>
+      <w:tblGrid>
+        <w:gridCol w:w="2880"/>
+        <w:gridCol w:w="2880"/>
+        <w:gridCol w:w="2880"/>
+      </w:tblGrid>
+      <w:tr>
+        <w:tc>
+          <w:tcPr>
+            <w:tcW w:type="dxa" w:w="2880"/>
+            <w:shd w:val="clear" w:color="auto" w:fill="1F6FEB"/>
+          </w:tcPr>
+          <w:p>
+            <w:r/>
+            <w:r>
+              <w:rPr>
+                <w:b/>
+                <w:color w:val="FFFFFF"/>
+                <w:sz w:val="19"/>
+              </w:rPr>
+              <w:t>Agent</w:t>
+            </w:r>
+          </w:p>
+        </w:tc>
+        <w:tc>
+          <w:tcPr>
+            <w:tcW w:type="dxa" w:w="2880"/>
+            <w:shd w:val="clear" w:color="auto" w:fill="1F6FEB"/>
+          </w:tcPr>
+          <w:p>
+            <w:r/>
+            <w:r>
+              <w:rPr>
+                <w:b/>
+                <w:color w:val="FFFFFF"/>
+                <w:sz w:val="19"/>
+              </w:rPr>
+              <w:t>Key features</w:t>
+            </w:r>
+          </w:p>
+        </w:tc>
+        <w:tc>
+          <w:tcPr>
+            <w:tcW w:type="dxa" w:w="2880"/>
+            <w:shd w:val="clear" w:color="auto" w:fill="1F6FEB"/>
+          </w:tcPr>
+          <w:p>
+            <w:r/>
+            <w:r>
+              <w:rPr>
+                <w:b/>
+                <w:color w:val="FFFFFF"/>
+                <w:sz w:val="19"/>
+              </w:rPr>
+              <w:t>Access (29 Oct 2026)</w:t>
+            </w:r>
+          </w:p>
+        </w:tc>
+      </w:tr>
+      <w:tr>
+        <w:tc>
+          <w:tcPr>
+            <w:tcW w:type="dxa" w:w="2880"/>
+          </w:tcPr>
+          <w:p>
+            <w:r/>
+            <w:r>
+              <w:rPr>
+                <w:sz w:val="19"/>
+              </w:rPr>
+              <w:t>Claude Duet</w:t>
+            </w:r>
+          </w:p>
+        </w:tc>
+        <w:tc>
+          <w:tcPr>
+            <w:tcW w:type="dxa" w:w="2880"/>
+          </w:tcPr>
+          <w:p>
+            <w:r/>
+            <w:r>
+              <w:rPr>
+                <w:sz w:val="19"/>
+              </w:rPr>
+              <w:t>Morning brief across connected apps; checks accounts every few hours and messages only when something needs you; own virtual machine and browser; 6,000+ connectors (Gmail, Slack, QuickBooks, Stripe, HubSpot, Docusign…); shows exactly what it will send, pay, sign or delete and waits for approval</w:t>
+            </w:r>
+          </w:p>
+        </w:tc>
+        <w:tc>
+          <w:tcPr>
+            <w:tcW w:type="dxa" w:w="2880"/>
+          </w:tcPr>
+          <w:p>
+            <w:r/>
+            <w:r>
+              <w:rPr>
+                <w:sz w:val="19"/>
+              </w:rPr>
+              <w:t>Research preview, US Pro/Max via waitlist</w:t>
+            </w:r>
+          </w:p>
+        </w:tc>
+      </w:tr>
+      <w:tr>
+        <w:tc>
+          <w:tcPr>
+            <w:tcW w:type="dxa" w:w="2880"/>
+          </w:tcPr>
+          <w:p>
+            <w:r/>
+            <w:r>
+              <w:rPr>
+                <w:sz w:val="19"/>
+              </w:rPr>
+              <w:t>Meta Muse</w:t>
+            </w:r>
+          </w:p>
+        </w:tc>
+        <w:tc>
+          <w:tcPr>
+            <w:tcW w:type="dxa" w:w="2880"/>
+          </w:tcPr>
+          <w:p>
+            <w:r/>
+            <w:r>
+              <w:rPr>
+                <w:sz w:val="19"/>
+              </w:rPr>
+              <w:t>Manages email, schedules and goals; Gmail, Google Calendar and Instagram connectors; Singapore partners (Shopee, Lazada, Grab, Singapore Airlines, Agoda, Klook, Trip.com, ShopBack) rolling out; checks before sending or buying; Muse Secure VM keeps passwords and payment methods out of the agent's view</w:t>
+            </w:r>
+          </w:p>
+        </w:tc>
+        <w:tc>
+          <w:tcPr>
+            <w:tcW w:type="dxa" w:w="2880"/>
+          </w:tcPr>
+          <w:p>
+            <w:r/>
+            <w:r>
+              <w:rPr>
+                <w:sz w:val="19"/>
+              </w:rPr>
+              <w:t>Singapore since 27 Oct 2026; free for most needs</w:t>
+            </w:r>
+          </w:p>
+        </w:tc>
+      </w:tr>
+      <w:tr>
+        <w:tc>
+          <w:tcPr>
+            <w:tcW w:type="dxa" w:w="2880"/>
+          </w:tcPr>
+          <w:p>
+            <w:r/>
+            <w:r>
+              <w:rPr>
+                <w:sz w:val="19"/>
+              </w:rPr>
+              <w:t>Grok Bot</w:t>
+            </w:r>
+          </w:p>
+        </w:tc>
+        <w:tc>
+          <w:tcPr>
+            <w:tcW w:type="dxa" w:w="2880"/>
+          </w:tcPr>
+          <w:p>
+            <w:r/>
+            <w:r>
+              <w:rPr>
+                <w:sz w:val="19"/>
+              </w:rPr>
+              <w:t>Persistent cloud computer (browser, command line, files) shared by your bots; watch live or take over for sign-ins; Gmail, Calendar, Sheets, Slack, Notion and MCP servers; its own @mail.grokbot.com address; Vault/1Password sign-ins and Auto Review</w:t>
+            </w:r>
+          </w:p>
+        </w:tc>
+        <w:tc>
+          <w:tcPr>
+            <w:tcW w:type="dxa" w:w="2880"/>
+          </w:tcPr>
+          <w:p>
+            <w:r/>
+            <w:r>
+              <w:rPr>
+                <w:sz w:val="19"/>
+              </w:rPr>
+              <w:t>Check your plan's access</w:t>
+            </w:r>
+          </w:p>
+        </w:tc>
+      </w:tr>
+      <w:tr>
+        <w:tc>
+          <w:tcPr>
+            <w:tcW w:type="dxa" w:w="2880"/>
+          </w:tcPr>
+          <w:p>
+            <w:r/>
+            <w:r>
+              <w:rPr>
+                <w:sz w:val="19"/>
+              </w:rPr>
+              <w:t>OpenAI Dots</w:t>
+            </w:r>
+          </w:p>
+        </w:tc>
+        <w:tc>
+          <w:tcPr>
+            <w:tcW w:type="dxa" w:w="2880"/>
+          </w:tcPr>
+          <w:p>
+            <w:r/>
+            <w:r>
+              <w:rPr>
+                <w:sz w:val="19"/>
+              </w:rPr>
+              <w:t>Several ongoing responsibilities per dot; its own cloud computer, optionally your computer; plugins for email, calendar and files; contact methods such as Slack; delegates to ChatGPT Work or Codex; schedules, event triggers and an Activity view</w:t>
+            </w:r>
+          </w:p>
+        </w:tc>
+        <w:tc>
+          <w:tcPr>
+            <w:tcW w:type="dxa" w:w="2880"/>
+          </w:tcPr>
+          <w:p>
+            <w:r/>
+            <w:r>
+              <w:rPr>
+                <w:sz w:val="19"/>
+              </w:rPr>
+              <w:t>Check access and preview limits for your account</w:t>
+            </w:r>
+          </w:p>
+        </w:tc>
+      </w:tr>
+      <w:tr>
+        <w:tc>
+          <w:tcPr>
+            <w:tcW w:type="dxa" w:w="2880"/>
+          </w:tcPr>
+          <w:p>
+            <w:r/>
+            <w:r>
+              <w:rPr>
+                <w:sz w:val="19"/>
+              </w:rPr>
+              <w:t>Manus Cue</w:t>
+            </w:r>
+          </w:p>
+        </w:tc>
+        <w:tc>
+          <w:tcPr>
+            <w:tcW w:type="dxa" w:w="2880"/>
+          </w:tcPr>
+          <w:p>
+            <w:r/>
+            <w:r>
+              <w:rPr>
+                <w:sz w:val="19"/>
+              </w:rPr>
+              <w:t>Each agent has its own email, phone number, wallet and computer; takes forwarded calls; pays within budgets you set; agents collaborate in a group chat; connectors (Gmail, Trip.com…) and routines; scan a QR code to create an agent</w:t>
+            </w:r>
+          </w:p>
+        </w:tc>
+        <w:tc>
+          <w:tcPr>
+            <w:tcW w:type="dxa" w:w="2880"/>
+          </w:tcPr>
+          <w:p>
+            <w:r/>
+            <w:r>
+              <w:rPr>
+                <w:sz w:val="19"/>
+              </w:rPr>
+              <w:t>Early access, free with an invite code</w:t>
+            </w:r>
+          </w:p>
+        </w:tc>
+      </w:tr>
+    </w:tbl>
+    <w:p>
+      <w:pPr>
+        <w:spacing w:after="40"/>
+      </w:pPr>
+    </w:p>
+    <w:p>
+      <w:pPr>
+        <w:pStyle w:val="Heading3"/>
+      </w:pPr>
+      <w:r>
+        <w:t>Manus — the general agent behind Cue</w:t>
+      </w:r>
+    </w:p>
+    <w:p>
+      <w:r>
+        <w:t>Manus is a general AI agent that delivers research, slides, websites, images, videos and charts. Core capabilities: deep research and synthesis; autonomous multi-step task execution across files, websites and tools; and automations and integrations (scheduled tasks, event triggers and connected apps). Manus 2.0 (28 September 2026) adds the Cascade agent harness, Cloud Computer, event-triggered Automations, Studio with a video editor and game development, and computer use on your own machine. Course prompts to try in Manus: research and build a slide deck comparing the Singapore and India AI startup ecosystems; a page tracking Singapore traffic from live camera feeds; interactive 3D models with sun-path analysis for HDB BTO projects.</w:t>
+      </w:r>
+    </w:p>
+    <w:p>
+      <w:r>
+        <w:rPr>
+          <w:color w:val="6B6862"/>
+          <w:sz w:val="17"/>
+        </w:rPr>
+        <w:t>Manus 2.0 and Cue: https://manus.im/blog/introducing-manus-2-0 ; https://cue.im/</w:t>
+      </w:r>
+    </w:p>
+    <w:p>
       <w:r>
         <w:rPr>
           <w:color w:val="6B6862"/>
@@ -4067,12 +4450,12 @@
         <w:pStyle w:val="Heading3"/>
       </w:pPr>
       <w:r>
-        <w:t>News added to the PPT: Muse is available in Singapore</w:t>
-      </w:r>
-    </w:p>
-    <w:p>
-      <w:r>
-        <w:t>Meta's official announcement dated 27 October 2026 confirms Singapore availability, Gmail/Google Calendar/Instagram connections, sensitive-action approval and free core use with optional subscriptions. Local partner features roll out progressively. This supersedes the article's earlier Muse regional information; inspect what is actually available in each account. Muse is the recommended morning route, with provisioned Dots or Grok Bot as alternatives.</w:t>
+        <w:t>Muse is available in Singapore</w:t>
+      </w:r>
+    </w:p>
+    <w:p>
+      <w:r>
+        <w:t>Meta's official announcement dated 27 October 2026 confirms Singapore availability, Gmail/Google Calendar/Instagram connections, sensitive-action approval and free core use with optional subscriptions. Local partner features roll out progressively. Muse is the recommended morning route, with provisioned Dots or Grok Bot as alternatives.</w:t>
       </w:r>
     </w:p>
     <w:p>
@@ -4103,7 +4486,7 @@
     </w:p>
     <w:p>
       <w:r>
-        <w:t>The class executes one route: Muse is recommended in Singapore; use Dots or Grok Bot only with an eligible account. Claude Duet is shown for reference (US Pro/Max research preview). Use only the trainer-assigned Google account and connect Gmail and Google Calendar separately.</w:t>
+        <w:t>The class executes one route: Muse is recommended in Singapore; use Dots or Grok Bot only with an eligible account. Claude Duet (US Pro/Max research preview) and Manus Cue (early access, invite code) are shown for reference. Use only the trainer-assigned Google account and connect Gmail and Google Calendar separately.</w:t>
       </w:r>
     </w:p>
     <w:p>
@@ -4116,42 +4499,42 @@
     </w:p>
     <w:p>
       <w:pPr>
-        <w:pStyle w:val="ListNumber"/>
-      </w:pPr>
-      <w:r>
-        <w:t>Install Muse from Meta (iOS / Android) or open muse.ai; confirm the developer is Meta Platforms, Inc.</w:t>
-      </w:r>
-    </w:p>
-    <w:p>
-      <w:pPr>
-        <w:pStyle w:val="ListNumber"/>
-      </w:pPr>
-      <w:r>
-        <w:t>Complete sign-in and onboarding; Facebook, Instagram and Threads link automatically through Accounts Center.</w:t>
-      </w:r>
-    </w:p>
-    <w:p>
-      <w:pPr>
-        <w:pStyle w:val="ListNumber"/>
-      </w:pPr>
-      <w:r>
-        <w:t>Go to Settings → Connectors → Connect beside Gmail → Continue.</w:t>
-      </w:r>
-    </w:p>
-    <w:p>
-      <w:pPr>
-        <w:pStyle w:val="ListNumber"/>
-      </w:pPr>
-      <w:r>
-        <w:t>Finish the Google login in the browser; repeat for Google Calendar.</w:t>
-      </w:r>
-    </w:p>
-    <w:p>
-      <w:pPr>
-        <w:pStyle w:val="ListNumber"/>
-      </w:pPr>
-      <w:r>
-        <w:t>Keep retrieve-only where offered and approve sends and invites. Shortcut: ask “Connect my Gmail”; disconnect anytime in Settings → Connectors.</w:t>
+        <w:pStyle w:val="ListBullet"/>
+      </w:pPr>
+      <w:r>
+        <w:t>Step 1 — Install Muse from Meta (iOS / Android) or open muse.ai; confirm the developer is Meta Platforms, Inc.</w:t>
+      </w:r>
+    </w:p>
+    <w:p>
+      <w:pPr>
+        <w:pStyle w:val="ListBullet"/>
+      </w:pPr>
+      <w:r>
+        <w:t>Step 2 — Complete sign-in and onboarding; Facebook, Instagram and Threads link automatically through Accounts Center.</w:t>
+      </w:r>
+    </w:p>
+    <w:p>
+      <w:pPr>
+        <w:pStyle w:val="ListBullet"/>
+      </w:pPr>
+      <w:r>
+        <w:t>Step 3 — Go to Settings → Connectors → Connect beside Gmail → Continue.</w:t>
+      </w:r>
+    </w:p>
+    <w:p>
+      <w:pPr>
+        <w:pStyle w:val="ListBullet"/>
+      </w:pPr>
+      <w:r>
+        <w:t>Step 4 — Finish the Google login in the browser; repeat for Google Calendar.</w:t>
+      </w:r>
+    </w:p>
+    <w:p>
+      <w:pPr>
+        <w:pStyle w:val="ListBullet"/>
+      </w:pPr>
+      <w:r>
+        <w:t>Step 5 — Keep retrieve-only where offered and approve sends and invites. Shortcut: ask “Connect my Gmail”; disconnect anytime in Settings → Connectors.</w:t>
       </w:r>
     </w:p>
     <w:p>
@@ -4173,42 +4556,42 @@
     </w:p>
     <w:p>
       <w:pPr>
-        <w:pStyle w:val="ListNumber"/>
-      </w:pPr>
-      <w:r>
-        <w:t>Open dots in the ChatGPT mobile app, desktop app or a desktop browser (mobile web is not supported) and follow the introduction.</w:t>
-      </w:r>
-    </w:p>
-    <w:p>
-      <w:pPr>
-        <w:pStyle w:val="ListNumber"/>
-      </w:pPr>
-      <w:r>
-        <w:t>Name your dot and choose its appearance; both can change later.</w:t>
-      </w:r>
-    </w:p>
-    <w:p>
-      <w:pPr>
-        <w:pStyle w:val="ListNumber"/>
-      </w:pPr>
-      <w:r>
-        <w:t>Connect plugins for email, calendar and files, authorising each one.</w:t>
-      </w:r>
-    </w:p>
-    <w:p>
-      <w:pPr>
-        <w:pStyle w:val="ListNumber"/>
-      </w:pPr>
-      <w:r>
-        <w:t>Optional: open the dot’s profile and select Add to connect a contact method such as Slack. A messaging channel does not grant inbox or computer access.</w:t>
-      </w:r>
-    </w:p>
-    <w:p>
-      <w:pPr>
-        <w:pStyle w:val="ListNumber"/>
-      </w:pPr>
-      <w:r>
-        <w:t>Describe an ongoing responsibility, its sources and which decisions need you. Ending a conversation does not necessarily stop assigned work; check Activity.</w:t>
+        <w:pStyle w:val="ListBullet"/>
+      </w:pPr>
+      <w:r>
+        <w:t>Step 1 — Open dots in the ChatGPT mobile app, desktop app or a desktop browser (mobile web is not supported) and follow the introduction.</w:t>
+      </w:r>
+    </w:p>
+    <w:p>
+      <w:pPr>
+        <w:pStyle w:val="ListBullet"/>
+      </w:pPr>
+      <w:r>
+        <w:t>Step 2 — Name your dot and choose its appearance; both can change later.</w:t>
+      </w:r>
+    </w:p>
+    <w:p>
+      <w:pPr>
+        <w:pStyle w:val="ListBullet"/>
+      </w:pPr>
+      <w:r>
+        <w:t>Step 3 — Connect plugins for email, calendar and files, authorising each one.</w:t>
+      </w:r>
+    </w:p>
+    <w:p>
+      <w:pPr>
+        <w:pStyle w:val="ListBullet"/>
+      </w:pPr>
+      <w:r>
+        <w:t>Step 4 — Optional: open the dot’s profile and select Add to connect a contact method such as Slack. A messaging channel does not grant inbox or computer access.</w:t>
+      </w:r>
+    </w:p>
+    <w:p>
+      <w:pPr>
+        <w:pStyle w:val="ListBullet"/>
+      </w:pPr>
+      <w:r>
+        <w:t>Step 5 — Describe an ongoing responsibility, its sources and which decisions need you. Ending a conversation does not necessarily stop assigned work; check Activity.</w:t>
       </w:r>
     </w:p>
     <w:p>
@@ -4230,42 +4613,42 @@
     </w:p>
     <w:p>
       <w:pPr>
-        <w:pStyle w:val="ListNumber"/>
-      </w:pPr>
-      <w:r>
-        <w:t>Start at x.ai/bot; install the desktop or mobile app and sign in.</w:t>
-      </w:r>
-    </w:p>
-    <w:p>
-      <w:pPr>
-        <w:pStyle w:val="ListNumber"/>
-      </w:pPr>
-      <w:r>
-        <w:t>Create a bot: sidebar + → Create a Bot → name it → Create.</w:t>
-      </w:r>
-    </w:p>
-    <w:p>
-      <w:pPr>
-        <w:pStyle w:val="ListNumber"/>
-      </w:pPr>
-      <w:r>
-        <w:t>Open Connect apps (mobile: avatar → Connect apps) and add Gmail.</w:t>
-      </w:r>
-    </w:p>
-    <w:p>
-      <w:pPr>
-        <w:pStyle w:val="ListNumber"/>
-      </w:pPr>
-      <w:r>
-        <w:t>Finish the Google login in the browser; repeat for Google Calendar.</w:t>
-      </w:r>
-    </w:p>
-    <w:p>
-      <w:pPr>
-        <w:pStyle w:val="ListNumber"/>
-      </w:pPr>
-      <w:r>
-        <w:t>Confirm both appear under Installed. “Added” does not mean signed in; choose Authenticate if an app shows Needs auth.</w:t>
+        <w:pStyle w:val="ListBullet"/>
+      </w:pPr>
+      <w:r>
+        <w:t>Step 1 — Start at x.ai/bot; install the desktop or mobile app and sign in.</w:t>
+      </w:r>
+    </w:p>
+    <w:p>
+      <w:pPr>
+        <w:pStyle w:val="ListBullet"/>
+      </w:pPr>
+      <w:r>
+        <w:t>Step 2 — Create a bot: sidebar + → Create a Bot → name it → Create.</w:t>
+      </w:r>
+    </w:p>
+    <w:p>
+      <w:pPr>
+        <w:pStyle w:val="ListBullet"/>
+      </w:pPr>
+      <w:r>
+        <w:t>Step 3 — Open Connect apps (mobile: avatar → Connect apps) and add Gmail.</w:t>
+      </w:r>
+    </w:p>
+    <w:p>
+      <w:pPr>
+        <w:pStyle w:val="ListBullet"/>
+      </w:pPr>
+      <w:r>
+        <w:t>Step 4 — Finish the Google login in the browser; repeat for Google Calendar.</w:t>
+      </w:r>
+    </w:p>
+    <w:p>
+      <w:pPr>
+        <w:pStyle w:val="ListBullet"/>
+      </w:pPr>
+      <w:r>
+        <w:t>Step 5 — Confirm both appear under Installed. “Added” does not mean signed in; choose Authenticate if an app shows Needs auth.</w:t>
       </w:r>
     </w:p>
     <w:p>
@@ -4292,42 +4675,42 @@
     </w:p>
     <w:p>
       <w:pPr>
-        <w:pStyle w:val="ListNumber"/>
-      </w:pPr>
-      <w:r>
-        <w:t>Have a Pro or Max plan and join the waitlist at claude.com/product/claude-duet.</w:t>
-      </w:r>
-    </w:p>
-    <w:p>
-      <w:pPr>
-        <w:pStyle w:val="ListNumber"/>
-      </w:pPr>
-      <w:r>
-        <w:t>Once invited, open the Claude Duet app (iOS / Android) or claude.ai.</w:t>
-      </w:r>
-    </w:p>
-    <w:p>
-      <w:pPr>
-        <w:pStyle w:val="ListNumber"/>
-      </w:pPr>
-      <w:r>
-        <w:t>Memory, skills and connected apps carry over from your Claude account.</w:t>
-      </w:r>
-    </w:p>
-    <w:p>
-      <w:pPr>
-        <w:pStyle w:val="ListNumber"/>
-      </w:pPr>
-      <w:r>
-        <w:t>Add connectors such as Gmail, Calendar or Slack from the Claude Marketplace.</w:t>
-      </w:r>
-    </w:p>
-    <w:p>
-      <w:pPr>
-        <w:pStyle w:val="ListNumber"/>
-      </w:pPr>
-      <w:r>
-        <w:t>Tell it what to watch and how often. It asks before it sends, pays, signs or deletes; some actions stay off-limits even with approval.</w:t>
+        <w:pStyle w:val="ListBullet"/>
+      </w:pPr>
+      <w:r>
+        <w:t>Step 1 — Have a Pro or Max plan and join the Claude Duet waitlist on claude.com.</w:t>
+      </w:r>
+    </w:p>
+    <w:p>
+      <w:pPr>
+        <w:pStyle w:val="ListBullet"/>
+      </w:pPr>
+      <w:r>
+        <w:t>Step 2 — Once invited, open the Claude Duet app (iOS / Android) or claude.ai.</w:t>
+      </w:r>
+    </w:p>
+    <w:p>
+      <w:pPr>
+        <w:pStyle w:val="ListBullet"/>
+      </w:pPr>
+      <w:r>
+        <w:t>Step 3 — Memory, skills and connected apps carry over from your Claude account.</w:t>
+      </w:r>
+    </w:p>
+    <w:p>
+      <w:pPr>
+        <w:pStyle w:val="ListBullet"/>
+      </w:pPr>
+      <w:r>
+        <w:t>Step 4 — Add connectors such as Gmail, Calendar or Slack from the Claude Marketplace.</w:t>
+      </w:r>
+    </w:p>
+    <w:p>
+      <w:pPr>
+        <w:pStyle w:val="ListBullet"/>
+      </w:pPr>
+      <w:r>
+        <w:t>Step 5 — Tell it what to watch and how often. It asks before it sends, pays, signs or deletes; some actions stay off-limits even with approval.</w:t>
       </w:r>
     </w:p>
     <w:p>
@@ -4337,6 +4720,63 @@
           <w:sz w:val="17"/>
         </w:rPr>
         <w:t>Introducing Claude Duet: https://claude.com/resources/articles/claude-duet</w:t>
+      </w:r>
+    </w:p>
+    <w:p>
+      <w:pPr>
+        <w:pStyle w:val="Heading3"/>
+      </w:pPr>
+      <w:r>
+        <w:t>Manus Cue (reference — early access)</w:t>
+      </w:r>
+    </w:p>
+    <w:p>
+      <w:pPr>
+        <w:pStyle w:val="ListBullet"/>
+      </w:pPr>
+      <w:r>
+        <w:t>Step 1 — Use cue.im on the web, the desktop app or Android; the iOS app is pending review.</w:t>
+      </w:r>
+    </w:p>
+    <w:p>
+      <w:pPr>
+        <w:pStyle w:val="ListBullet"/>
+      </w:pPr>
+      <w:r>
+        <w:t>Step 2 — Sign up with an invite code from your trainer or an existing user during early access.</w:t>
+      </w:r>
+    </w:p>
+    <w:p>
+      <w:pPr>
+        <w:pStyle w:val="ListBullet"/>
+      </w:pPr>
+      <w:r>
+        <w:t>Step 3 — Create an agent and give it one responsibility and the context it needs.</w:t>
+      </w:r>
+    </w:p>
+    <w:p>
+      <w:pPr>
+        <w:pStyle w:val="ListBullet"/>
+      </w:pPr>
+      <w:r>
+        <w:t>Step 4 — Choose its email, phone, wallet and computer; set wallet budgets and which actions need your approval.</w:t>
+      </w:r>
+    </w:p>
+    <w:p>
+      <w:pPr>
+        <w:pStyle w:val="ListBullet"/>
+      </w:pPr>
+      <w:r>
+        <w:t>Step 5 — Connect Gmail or other services, then define routines for steps you repeat. Keep budgets small and require approval for payments, calls and messages.</w:t>
+      </w:r>
+    </w:p>
+    <w:p>
+      <w:r>
+        <w:rPr>
+          <w:color w:val="6B6862"/>
+          <w:sz w:val="17"/>
+        </w:rPr>
+        <w:t>Cue by Manus: https://cue.im/ ; Manus 2.0 announcement: https://manus.im/blog/introducing-manus-2-0</w:t>
       </w:r>
     </w:p>
     <w:p>

</xml_diff>

<commit_message>
Courseware v3.3: QA fixes (Day 1 table fit, activity cards, LG Activity 1 parts, WhatsApp in Part A, no stock 'Key takeaways')
Co-Authored-By: Claude Opus 5.5 <noreply@anthropic.com>
</commit_message>
<xml_diff>
--- a/courseware/LG-Human-AI Workforce with Autonomous AI Agents.docx
+++ b/courseware/LG-Human-AI Workforce with Autonomous AI Agents.docx
@@ -6698,7 +6698,7 @@
     </w:p>
     <w:p>
       <w:r>
-        <w:t xml:space="preserve">Activity 1 has two parts. </w:t>
+        <w:t xml:space="preserve">Activity 1 has three parts. </w:t>
       </w:r>
       <w:r>
         <w:rPr>
@@ -6716,7 +6716,16 @@
         <w:t>1B, if your ChatGPT plan includes dots:</w:t>
       </w:r>
       <w:r>
-        <w:t xml:space="preserve"> set up an OpenAI Dot and give it a standing job. Grok Bot, Claude Duet (US Pro/Max research preview) and Manus Cue (early access, invite code) are shown for reference. Use only the trainer-assigned Google account and connect Gmail and Google Calendar separately.</w:t>
+        <w:t xml:space="preserve"> set up an OpenAI Dot and give it a standing job. </w:t>
+      </w:r>
+      <w:r>
+        <w:rPr>
+          <w:b/>
+        </w:rPr>
+        <w:t>1C, everyone:</w:t>
+      </w:r>
+      <w:r>
+        <w:t xml:space="preserve"> install Wispr Flow and speak your prompts instead of typing them. Grok Bot, Claude Duet (US Pro/Max research preview) and Manus Cue (early access, invite code) are shown for reference. Use only the trainer-assigned Google account and connect Gmail and Google Calendar separately.</w:t>
       </w:r>
     </w:p>
     <w:p>

</xml_diff>